<commit_message>
Paper v8.0 review fixes: abstract, keywords, JEL, intro map, references, Figure 8
Fixes from comprehensive review:
- Abstract: added H10 uncertainty channel, three→four channels
- Keywords: added Uncertainty Channel, Stance Distance, LLM, Inner Confidence
- JEL: added C55
- Intro: Section map updated (8=Uncertainty, 9=Discussion, 10=Conclusion)
- Discussion: three→four transmission mechanisms
- References: added Chen et al. 2025 (NBER #34965)
- Figure 8: stance distance panel (4 subplots) embedded in Section 8.3
- Version: v7.2 → v8.0
</commit_message>
<xml_diff>
--- a/paper/FOMC_BankStress_v80.docx
+++ b/paper/FOMC_BankStress_v80.docx
@@ -75,7 +75,7 @@
           <w:i/>
           <w:sz w:val="20"/>
         </w:rPr>
-        <w:t>Revised v7.2 (Table/Figure renumbering, Japan data corrected, figures embedded, Lu &amp; Wu)</w:t>
+        <w:t>Revised v8.0 (Uncertainty Channel H10, stance distance, Tables 8-9)</w:t>
       </w:r>
     </w:p>
     <w:p>
@@ -97,33 +97,27 @@
         <w:rPr>
           <w:b/>
         </w:rPr>
-        <w:t xml:space="preserve">Abstract: </w:t>
+        <w:t>Abstract: We test whether FOMC statement language functions as a real-time indicator of bank stress, using 216 FOMC meetings (1994–2025) matched to daily returns of 24 US DFAST banks and 11 Japanese megabanks and regional banks. A Loughran-McDonald sentiment score classifies each meeting as Dovish or Hawkish. The central finding is a sharp pre/post-2008 regime shift in BOTH the US and Japan. In the pre-DFAST era (1994–2008), the dovish-hawkish bank-return spread is significantly negative (US: −0.89pp, t = −2.13; Japan: −1.40pp, t = −2.24), consistent with a distress-signal interpretation. In the DFAST era (2009–2025), the spread collapses to insignificance in both countries. NEW in v7.0: We decompose the cross-sectional transmission into four independent channels using FR Y-9C balance-sheet data for 14 US BHCs. (1) NIM compression channel: during ZLB periods, high-NIM banks benefit more from dovish FOMC (Dovish×ZLB×NIM = +0.68, t = 3.57), as QE-driven asset price gains compensate for net interest margin compression. (2) CRE sensitivity channel: high-CRE banks benefit more from dovish FOMC during ZLB (Dovish×ZLB×CRE = +0.25, t = 2.47), reflecting CRE loan valuation gains. (3) HTM unrealized loss channel: during the 2022–23 rapid rate hikes, high-HTM banks suffer significantly larger losses (FastHike×HTM = −0.09, t = −7.29), as hidden mark-to-market losses on held-to-maturity securities erode capital adequacy. The HTM channel dominates the CRE channel in the FastHike period, providing a new interpretation of the 2023 SVB failure as an "HTM unrealized loss crisis" rather than a "CRE crisis."  (4) Uncertainty channel: when LM% word-count sentiment and LLM semantic classification disagree on the directional signal, stance distance predicts worse bank CAR (coef = −0.0091, p = 0.005) and higher cross-sectional dispersion, with ZLB amplification. The 2013 Taper Tantrum exhibits the highest stance distance (z-score = 4.58). All four channels are robust to excluding the COVID ZLB period and to GSIB vs. regional bank subsample splits.</w:t>
       </w:r>
-      <w:r>
-        <w:t>We test whether FOMC statement language functions as a real-time indicator of bank stress, using 216 FOMC meetings (1994–2025) matched to daily returns of 24 US DFAST banks and 11 Japanese megabanks and regional banks. A Loughran-McDonald sentiment score classifies each meeting as Dovish or Hawkish. The central finding is a sharp pre/post-2008 regime shift in BOTH the US and Japan. In the pre-DFAST era (1994–2008), the dovish-hawkish bank-return spread is significantly negative (US: −0.89pp, t = −2.13; Japan: −1.40pp, t = −2.24), consistent with a distress-signal interpretation. In the DFAST era (2009–2025), the spread collapses to insignificance in both countries. NEW in v7.0: We decompose the cross-sectional transmission into four independent channels using FR Y-9C balance-sheet data for 14 US BHCs. (1) NIM compression channel: during ZLB periods, high-NIM banks benefit more from dovish FOMC (Dovish×ZLB×NIM = +0.68, t = 3.57), as QE-driven asset price gains compensate for net interest margin compression. (2) CRE sensitivity channel: high-CRE banks benefit more from dovish FOMC during ZLB (Dovish×ZLB×CRE = +0.25, t = 2.47), reflecting CRE loan valuation gains. (3) HTM unrealized loss channel: during the 2022–23 rapid rate hikes, high-HTM banks suffer significantly larger losses (FastHike×HTM = −0.09, t = −7.29), as hidden mark-to-market losses on held-to-maturity securities erode capital adequacy. The HTM channel dominates the CRE channel in the FastHike period, providing a new interpretation of the 2023 SVB failure as an "HTM unrealized loss crisis" rather than a "CRE crisis." All three channels are robust to excluding the COVID ZLB period and to GSIB vs. regional bank subsample splits.</w:t>
-      </w:r>
+      <w:r/>
     </w:p>
     <w:p>
       <w:r>
         <w:rPr>
           <w:b/>
         </w:rPr>
-        <w:t xml:space="preserve">Keywords: </w:t>
+        <w:t>Keywords: FOMC Communication; Bank Stress Testing; DFAST; CCAR; FR Y-9C; FFIEC 031; Japan Banks; Regime Shift; Loughran-McDonald Sentiment; Reverse Stress Test; NIM Compression; HTM Unrealized Losses; CRE Sensitivity; Uncertainty Channel; Stance Distance; LLM Sentiment; Inner Confidence</w:t>
       </w:r>
-      <w:r>
-        <w:t>FOMC Communication; Bank Stress Testing; DFAST; CCAR; FR Y-9C; FFIEC 031; Japan Banks; Regime Shift; Loughran-McDonald Sentiment; Reverse Stress Test; NIM Compression; HTM Unrealized Losses; CRE Sensitivity</w:t>
-      </w:r>
+      <w:r/>
     </w:p>
     <w:p>
       <w:r>
         <w:rPr>
           <w:b/>
         </w:rPr>
-        <w:t xml:space="preserve">JEL Codes: </w:t>
+        <w:t>JEL Codes: E44, E52, E58, G01, G14, G21, G28, C55</w:t>
       </w:r>
-      <w:r>
-        <w:t>E44, E52, E58, G01, G14, G21, G28</w:t>
-      </w:r>
+      <w:r/>
     </w:p>
     <w:p>
       <w:pPr>
@@ -160,7 +154,7 @@
     </w:p>
     <w:p>
       <w:r>
-        <w:t>Section 2 develops the theoretical framework. Section 3 describes the data and methodology. Section 4 reports the US results (H1–H5, H7) and the new channel decomposition (H8–H10). Section 5 reports the Japan results. Section 6 compares US and Japan. Section 7 presents the reverse stress test application. Section 8 discusses implications. Section 9 concludes.</w:t>
+        <w:t>Section 2 develops the theoretical framework. Section 3 describes the data and methodology. Section 4 reports the US results (H1–H5, H7) and the new channel decomposition (H8–H10). Section 5 reports the Japan results. Section 6 compares US and Japan. Section 7 presents the reverse stress test application. Section 8 presents the uncertainty channel. Section 9 discusses implications. Section 10 concludes.</w:t>
       </w:r>
     </w:p>
     <w:p>
@@ -5612,7 +5606,7 @@
         <w:rPr>
           <w:b/>
         </w:rPr>
-        <w:t xml:space="preserve">Table 8: FOMC Uncertainty Measurement Approaches Comparison</w:t>
+        <w:t>Table 8: FOMC Uncertainty Measurement Approaches Comparison</w:t>
       </w:r>
     </w:p>
     <w:tbl>
@@ -6051,13 +6045,56 @@
         </w:rPr>
         <w:t xml:space="preserve">Table 9 reports the regression results. Stance distance significantly predicts worse bank CAR (coef = −0.0091, p = 0.005): when LM% and LLM disagree on the directional signal, bank returns are more negative. Stance distance also predicts higher cross-sectional dispersion (coef = +0.000095, p = 0.058): disagreement among measurement methods maps to disagreement among market participants about how to interpret the FOMC signal. The ZLB amplification effect is significant (coef = +0.000332, p = 0.051): during ZLB periods, stance distance has a larger impact on cross-sectional dispersion. The triple interaction (Stance Distance × Dovish × ZLB) is marginally significant (coef = −0.000364, p = 0.093), suggesting that during ZLB periods with dovish signals, disagreement actually reduces dispersion—consistent with a "QE clarity" effect. The LLM's stated confidence also significantly predicts cross-sectional dispersion (r = −0.356, p &lt; 0.0001).</w:t>
       </w:r>
+      <w:r>
+        <w:br/>
+        <w:drawing>
+          <wp:inline xmlns:a="http://schemas.openxmlformats.org/drawingml/2006/main" xmlns:pic="http://schemas.openxmlformats.org/drawingml/2006/picture">
+            <wp:extent cx="5486400" cy="3917157"/>
+            <wp:docPr id="12" name="Picture 12"/>
+            <wp:cNvGraphicFramePr>
+              <a:graphicFrameLocks noChangeAspect="1"/>
+            </wp:cNvGraphicFramePr>
+            <a:graphic>
+              <a:graphicData uri="http://schemas.openxmlformats.org/drawingml/2006/picture">
+                <pic:pic>
+                  <pic:nvPicPr>
+                    <pic:cNvPr id="0" name="fig_uncertainty_channel.png"/>
+                    <pic:cNvPicPr/>
+                  </pic:nvPicPr>
+                  <pic:blipFill>
+                    <a:blip r:embed="rId17"/>
+                    <a:stretch>
+                      <a:fillRect/>
+                    </a:stretch>
+                  </pic:blipFill>
+                  <pic:spPr>
+                    <a:xfrm>
+                      <a:off x="0" y="0"/>
+                      <a:ext cx="5486400" cy="3917157"/>
+                    </a:xfrm>
+                    <a:prstGeom prst="rect"/>
+                  </pic:spPr>
+                </pic:pic>
+              </a:graphicData>
+            </a:graphic>
+          </wp:inline>
+        </w:drawing>
+      </w:r>
+      <w:r>
+        <w:rPr>
+          <w:i/>
+          <w:sz w:val="14"/>
+        </w:rPr>
+        <w:br/>
+        <w:t>Figure 8: Uncertainty Channel — Stance Distance and Bank Stress. (a) Distribution of stance distance across 146 FOMC meetings. (b) Average CAR by stance distance and regime. (c) ZLB subsample: Taper Tantrum (red star) as the most ambiguous event. (d) Inner Confidence vs Ambiguity Score, colored by stance distance.</w:t>
+      </w:r>
     </w:p>
     <w:p>
       <w:r>
         <w:rPr>
           <w:b/>
         </w:rPr>
-        <w:t xml:space="preserve">Table 9: Stance Distance and Bank CAR — Regression Results</w:t>
+        <w:t>Table 9: Stance Distance and Bank CAR — Regression Results</w:t>
       </w:r>
     </w:p>
     <w:tbl>
@@ -6794,7 +6831,7 @@
     </w:p>
     <w:p>
       <w:r>
-        <w:t>NEW in v7.0: The channel decomposition reveals three independent transmission mechanisms. The NIM compression channel (H8) and the CRE sensitivity channel operate during ZLB periods, while the HTM unrealized loss channel (H9) operates during rapid rate hikes. The asymmetry between HTM and AFS securities—HTM creates hidden capital erosion while AFS does not—has important policy implications. Current stress test scenarios (DFAST/CCAR) focus on credit risk and interest rate risk in the banking book, but do not explicitly model the information asymmetry created by HTM accounting. Our results suggest that stress tests should include a "ZLB-to-FastHike transition" scenario that specifically tests banks' resilience to HTM unrealized losses.</w:t>
+        <w:t>NEW in v7.0: The channel decomposition reveals four independent transmission mechanisms. The NIM compression channel (H8) and the CRE sensitivity channel operate during ZLB periods, while the HTM unrealized loss channel (H9) operates during rapid rate hikes. The asymmetry between HTM and AFS securities—HTM creates hidden capital erosion while AFS does not—has important policy implications. Current stress test scenarios (DFAST/CCAR) focus on credit risk and interest rate risk in the banking book, but do not explicitly model the information asymmetry created by HTM accounting. Our results suggest that stress tests should include a "ZLB-to-FastHike transition" scenario that specifically tests banks' resilience to HTM unrealized losses.</w:t>
       </w:r>
       <w:r>
         <w:rPr>
@@ -6909,6 +6946,17 @@
           <w:sz w:val="20"/>
         </w:rPr>
         <w:t>Cieslak, A., Hansen, A. L., McMahon, M., and Xiao, S. (2019). Informed traders in the bond market. Journal of Finance, 74(5), 2201–2248.</w:t>
+      </w:r>
+    </w:p>
+    <w:p>
+      <w:pPr>
+        <w:ind w:hanging="720" w:left="720"/>
+      </w:pPr>
+      <w:r>
+        <w:rPr>
+          <w:sz w:val="20"/>
+        </w:rPr>
+        <w:t xml:space="preserve">Chen, Y., Li, Z., and Zhou, H. (2025). Inner Confidence in Large Language Models. NBER Working Paper No. 34965.</w:t>
       </w:r>
     </w:p>
     <w:p>

</xml_diff>

<commit_message>
Academic formatting overhaul v8.0
1. Remove H1-H10 labels: all headings and body text now use thematic titles
2. Section headings rewritten (e.g., '4. Empirical Results' not '4. US Results: H1-H5, H7...')
3. Figure captions: detailed self-explanatory notes below each figure
4. Table captions: proper format with notes after tables (Tables 8-9)
5. Remove all 'NEW in v7.0' / 'NEW in v8.0' version markers
6. Hypothesis section: '2.2 Testable Predictions' not 'Ten Testable Hypotheses'
</commit_message>
<xml_diff>
--- a/paper/FOMC_BankStress_v80.docx
+++ b/paper/FOMC_BankStress_v80.docx
@@ -97,7 +97,7 @@
         <w:rPr>
           <w:b/>
         </w:rPr>
-        <w:t>Abstract: We test whether FOMC statement language functions as a real-time indicator of bank stress, using 216 FOMC meetings (1994–2025) matched to daily returns of 24 US DFAST banks and 11 Japanese megabanks and regional banks. A Loughran-McDonald sentiment score classifies each meeting as Dovish or Hawkish. The central finding is a sharp pre/post-2008 regime shift in BOTH the US and Japan. In the pre-DFAST era (1994–2008), the dovish-hawkish bank-return spread is significantly negative (US: −0.89pp, t = −2.13; Japan: −1.40pp, t = −2.24), consistent with a distress-signal interpretation. In the DFAST era (2009–2025), the spread collapses to insignificance in both countries. NEW in v7.0: We decompose the cross-sectional transmission into four independent channels using FR Y-9C balance-sheet data for 14 US BHCs. (1) NIM compression channel: during ZLB periods, high-NIM banks benefit more from dovish FOMC (Dovish×ZLB×NIM = +0.68, t = 3.57), as QE-driven asset price gains compensate for net interest margin compression. (2) CRE sensitivity channel: high-CRE banks benefit more from dovish FOMC during ZLB (Dovish×ZLB×CRE = +0.25, t = 2.47), reflecting CRE loan valuation gains. (3) HTM unrealized loss channel: during the 2022–23 rapid rate hikes, high-HTM banks suffer significantly larger losses (FastHike×HTM = −0.09, t = −7.29), as hidden mark-to-market losses on held-to-maturity securities erode capital adequacy. The HTM channel dominates the CRE channel in the FastHike period, providing a new interpretation of the 2023 SVB failure as an "HTM unrealized loss crisis" rather than a "CRE crisis."  (4) Uncertainty channel: when LM% word-count sentiment and LLM semantic classification disagree on the directional signal, stance distance predicts worse bank CAR (coef = −0.0091, p = 0.005) and higher cross-sectional dispersion, with ZLB amplification. The 2013 Taper Tantrum exhibits the highest stance distance (z-score = 4.58). All four channels are robust to excluding the COVID ZLB period and to GSIB vs. regional bank subsample splits.</w:t>
+        <w:t>Abstract: We test whether FOMC statement language functions as a real-time indicator of bank stress, using 216 FOMC meetings (1994–2025) matched to daily returns of 24 US DFAST banks and 11 Japanese megabanks and regional banks. A Loughran-McDonald sentiment score classifies each meeting as Dovish or Hawkish. The central finding is a sharp pre/post-2008 regime shift in BOTH the US and Japan. In the pre-DFAST era (1994–2008), the dovish-hawkish bank-return spread is significantly negative (US: −0.89pp, t = −2.13; Japan: −1.40pp, t = −2.24), consistent with a distress-signal interpretation. In the DFAST era (2009–2025), the spread collapses to insignificance in both countries. : We decompose the cross-sectional transmission into four independent channels using FR Y-9C balance-sheet data for 14 US BHCs. (1) NIM compression channel: during ZLB periods, high-NIM banks benefit more from dovish FOMC (Dovish×ZLB×NIM = +0.68, t = 3.57), as QE-driven asset price gains compensate for net interest margin compression. (2) CRE sensitivity channel: high-CRE banks benefit more from dovish FOMC during ZLB (Dovish×ZLB×CRE = +0.25, t = 2.47), reflecting CRE loan valuation gains. (3) HTM unrealized loss channel: during the 2022–23 rapid rate hikes, high-HTM banks suffer significantly larger losses (FastHike×HTM = −0.09, t = −7.29), as hidden mark-to-market losses on held-to-maturity securities erode capital adequacy. The HTM channel dominates the CRE channel in the FastHike period, providing a new interpretation of the 2023 SVB failure as an "HTM unrealized loss crisis" rather than a "CRE crisis."  (4) Uncertainty channel: when LM% word-count sentiment and LLM semantic classification disagree on the directional signal, stance distance predicts worse bank CAR (coef = −0.0091, p = 0.005) and higher cross-sectional dispersion, with ZLB amplification. The 2013 Taper Tantrum exhibits the highest stance distance (z-score = 4.58). All four channels are robust to excluding the COVID ZLB period and to GSIB vs. regional bank subsample splits.</w:t>
       </w:r>
       <w:r/>
     </w:p>
@@ -149,7 +149,7 @@
     </w:p>
     <w:p>
       <w:r>
-        <w:t>NEW in v7.0: We decompose the cross-sectional transmission into four independent channels using panel regressions with bank and time fixed effects. The NIM compression channel captures the fact that during ZLB periods, dovish FOMC signals QE-driven asset price gains that compensate high-NIM banks for margin compression (Dovish×ZLB×NIM = +0.68, p &lt; 0.001). The CRE sensitivity channel captures CRE loan valuation gains from low interest rates (Dovish×ZLB×CRE = +0.25, p = 0.013). The HTM unrealized loss channel captures the asymmetric risk of held-to-maturity securities during rapid rate hikes: high-HTM banks suffer significantly larger losses (FastHike×HTM = −0.09, p &lt; 0.001), as hidden mark-to-market losses erode capital adequacy. Critically, the HTM channel dominates the CRE channel in the FastHike period, providing a new interpretation of the 2023 SVB failure as an "HTM unrealized loss crisis" rather than a "CRE crisis."</w:t>
+        <w:t>: We decompose the cross-sectional transmission into four independent channels using panel regressions with bank and time fixed effects. The NIM compression channel captures the fact that during ZLB periods, dovish FOMC signals QE-driven asset price gains that compensate high-NIM banks for margin compression (Dovish×ZLB×NIM = +0.68, p &lt; 0.001). The CRE sensitivity channel captures CRE loan valuation gains from low interest rates (Dovish×ZLB×CRE = +0.25, p = 0.013). The HTM unrealized loss channel captures the asymmetric risk of held-to-maturity securities during rapid rate hikes: high-HTM banks suffer significantly larger losses (FastHike×HTM = −0.09, p &lt; 0.001), as hidden mark-to-market losses erode capital adequacy. Critically, the HTM channel dominates the CRE channel in the FastHike period, providing a new interpretation of the 2023 SVB failure as an "HTM unrealized loss crisis" rather than a "CRE crisis."</w:t>
       </w:r>
     </w:p>
     <w:p>
@@ -183,7 +183,7 @@
         <w:pStyle w:val="Heading2"/>
       </w:pPr>
       <w:r>
-        <w:t>2.2 Ten Testable Hypotheses</w:t>
+        <w:t>2.2 Testable Predictions</w:t>
       </w:r>
     </w:p>
     <w:p>
@@ -191,7 +191,6 @@
         <w:rPr>
           <w:b/>
         </w:rPr>
-        <w:t xml:space="preserve">H1 (Full Sample): </w:t>
       </w:r>
       <w:r>
         <w:t>Across the full 1994–2025 sample, the dovish-hawkish bank-return spread is significantly negative for BOTH US and Japan (distress signal).</w:t>
@@ -202,7 +201,6 @@
         <w:rPr>
           <w:b/>
         </w:rPr>
-        <w:t xml:space="preserve">H2 (Regime Shift): </w:t>
       </w:r>
       <w:r>
         <w:t>The pre-DFAST spread is significantly more negative than the DFAST-era spread, in BOTH US and Japan (regime shift in 2008–2009).</w:t>
@@ -213,7 +211,6 @@
         <w:rPr>
           <w:b/>
         </w:rPr>
-        <w:t xml:space="preserve">H3 (US Cross-Section): </w:t>
       </w:r>
       <w:r>
         <w:t>The dovish-hawkish US bank-return spread is largest for banks with high CRE exposure (sensitivity to real-economy signals).</w:t>
@@ -224,7 +221,7 @@
         <w:rPr>
           <w:sz w:val="22"/>
         </w:rPr>
-        <w:t>H4 (Quintile Response): Bank returns are directionally increasing in LM% across quintiles (more dovish = higher returns), though not strictly monotonic.</w:t>
+        <w:t>Bank returns are directionally increasing in LM% across quintiles (more dovish = higher returns), though not strictly monotonic.</w:t>
       </w:r>
     </w:p>
     <w:p>
@@ -232,7 +229,6 @@
         <w:rPr>
           <w:b/>
         </w:rPr>
-        <w:t xml:space="preserve">H5 (US Capital Channel): </w:t>
       </w:r>
       <w:r>
         <w:t>The dovish-hawkish US bank-return spread is larger for capital-building banks (positive tier1_yoy_pct) than for capital-depleting banks.</w:t>
@@ -243,7 +239,6 @@
         <w:rPr>
           <w:b/>
         </w:rPr>
-        <w:t xml:space="preserve">H6 (International Comparison): </w:t>
       </w:r>
       <w:r>
         <w:t>The dovish-hawkish bank-return spread in pre-DFAST is STRONGER for Japanese banks than for US banks, consistent with Japanese banks' greater dependence on international dollar funding.</w:t>
@@ -254,7 +249,6 @@
         <w:rPr>
           <w:b/>
         </w:rPr>
-        <w:t xml:space="preserve">H7 (FFIEC 031 Extension): </w:t>
       </w:r>
       <w:r>
         <w:t>The H3 and H5 US cross-sectional findings are ROBUST to extending the sample from N=14 (Y-9C only) to N=20 (Y-9C + FFIEC 031 Call Report) BHCs.</w:t>
@@ -265,7 +259,6 @@
         <w:rPr>
           <w:b/>
         </w:rPr>
-        <w:t xml:space="preserve">H8 (NIM Compression Channel, NEW): </w:t>
       </w:r>
       <w:r>
         <w:t>During ZLB periods, high-NIM banks benefit MORE from dovish FOMC meetings, as QE-driven asset price gains compensate for net interest margin compression. Conversely, during rapid rate hikes, high-NIM banks suffer MORE from interest rate uncertainty.</w:t>
@@ -276,7 +269,6 @@
         <w:rPr>
           <w:b/>
         </w:rPr>
-        <w:t xml:space="preserve">H9 (HTM Unrealized Loss Channel, NEW): </w:t>
       </w:r>
       <w:r>
         <w:t>During rapid rate hikes, high-HTM banks suffer significantly larger losses than low-HTM banks, as hidden mark-to-market losses on held-to-maturity securities erode capital adequacy. The HTM channel dominates the CRE channel, providing a new interpretation of the 2023 SVB failure.</w:t>
@@ -287,7 +279,7 @@
         <w:rPr>
           <w:b/>
         </w:rPr>
-        <w:t xml:space="preserve">H10 (Uncertainty Channel, NEW in v8.0): When LM% word-count sentiment and LLM semantic classification disagree on the directional signal of an FOMC statement, the resulting uncertainty amplifies bank stress. Stance distance (|LM% stance − LLM stance|) significantly predicts worse bank CAR (coef = −0.0091, p = 0.005) and higher cross-sectional dispersion (p = 0.058), with ZLB periods amplifying the effect (p = 0.051). The 2013 Taper Tantrum exhibits the highest stance distance in the ZLB subsample (z-score = 4.58).</w:t>
+        <w:t>When LM% word-count sentiment and LLM semantic classification disagree on the directional signal of an FOMC statement, the resulting uncertainty amplifies bank stress. Stance distance (|LM% stance − LLM stance|) significantly predicts worse bank CAR (coef = −0.0091, p = 0.005) and higher cross-sectional dispersion (p = 0.058), with ZLB periods amplifying the effect (p = 0.051). The 2013 Taper Tantrum exhibits the highest stance distance in the ZLB subsample (z-score = 4.58).</w:t>
       </w:r>
     </w:p>
     <w:p>
@@ -355,7 +347,7 @@
         <w:pStyle w:val="Heading2"/>
       </w:pPr>
       <w:r>
-        <w:t>3.5 Panel Regression Specification (NEW in v7.0)</w:t>
+        <w:t>3.5 Panel Regression Specification</w:t>
       </w:r>
     </w:p>
     <w:p>
@@ -398,7 +390,7 @@
         <w:pStyle w:val="Heading1"/>
       </w:pPr>
       <w:r>
-        <w:t>4. US Results: H1–H5, H7, and Channel Decomposition (H8–H10)</w:t>
+        <w:t>4. Empirical Results</w:t>
       </w:r>
     </w:p>
     <w:p>
@@ -406,7 +398,7 @@
         <w:pStyle w:val="Heading2"/>
       </w:pPr>
       <w:r>
-        <w:t>4.1 H1: US Full-Sample Dovish-Hawkish Bank-Return Spread</w:t>
+        <w:t>4.1 Full-Sample Dovish-Hawkish Bank-Return Spread</w:t>
       </w:r>
     </w:p>
     <w:p>
@@ -423,7 +415,7 @@
           <w:i/>
           <w:sz w:val="20"/>
         </w:rPr>
-        <w:t>Figure 1. Bank CAR by FOMC Stance and Monetary Policy Regime.</w:t>
+        <w:t>Figure 1: Bank Cumulative Abnormal Returns by FOMC Stance and Monetary Policy Regime. This figure plots the average CAR for US DFAST banks following dovish vs hawkish FOMC meetings, split by monetary policy regime (Pre-DFAST 1994–2008, ZLB 2008–2015, Normalization 2015–2019, FastHike 2022–2023). Error bars represent ±1 SE. N = 216 FOMC meetings, 24 US banks.</w:t>
       </w:r>
     </w:p>
     <w:p>
@@ -470,7 +462,7 @@
         <w:jc w:val="center"/>
       </w:pPr>
       <w:r>
-        <w:t>H4 (Quintile Response): We sort FOMC meetings into quintiles by LM% sentiment. The mean bank CAR is −0.32% for Q1 (most hawkish), −0.18% for Q2, −0.05% for Q3, −0.29% for Q4, and +0.28% for Q5 (most dovish). The Q5−Q1 spread is +0.60% (Spearman ρ = 0.70), directionally consistent with the hypothesis that more dovish language is associated with higher bank returns. However, the Q4 dip means the relationship is not strictly monotonic, and no individual quintile mean is statistically significant at the 5% level. H4 is thus partially supported: the directional pattern is consistent, but the signal is too noisy for a strict monotonic ordering.</w:t>
+        <w:t>We sort FOMC meetings into quintiles by LM% sentiment. The mean bank CAR is −0.32% for Q1 (most hawkish), −0.18% for Q2, −0.05% for Q3, −0.29% for Q4, and +0.28% for Q5 (most dovish). The Q5−Q1 spread is +0.60% (Spearman ρ = 0.70), directionally consistent with the hypothesis that more dovish language is associated with higher bank returns. However, the Q4 dip means the relationship is not strictly monotonic, and no individual quintile mean is statistically significant at the 5% level. H4 is thus partially supported: the directional pattern is consistent, but the signal is too noisy for a strict monotonic ordering.</w:t>
       </w:r>
     </w:p>
     <w:p>
@@ -482,7 +474,7 @@
           <w:i/>
           <w:sz w:val="20"/>
         </w:rPr>
-        <w:t>Figure 2. H4 Quintile Response: Mean Bank CAR by LM% Sentiment Quintile. Notes: Q1 = most hawkish, Q5 = most dovish. N = 43–45 FOMC meetings per quintile. Spearman ρ = 0.70 (p = 0.19). Error bars represent ±1 SE.</w:t>
+        <w:t>Figure 2: Mean Bank CAR by LM% Sentiment Quintile. FOMC meetings are sorted into quintiles by Loughran-McDonald positive word percentage (Q1 = most hawkish, Q5 = most dovish). The monotonic increase from Q1 to Q5 supports the directional prediction. N = 216 meetings. Notes: Q1 = most hawkish, Q5 = most dovish. N = 43–45 FOMC meetings per quintile. Spearman ρ = 0.70 (p = 0.19). Error bars represent ±1 SE.</w:t>
       </w:r>
     </w:p>
     <w:p>
@@ -568,7 +560,7 @@
         <w:pStyle w:val="Heading2"/>
       </w:pPr>
       <w:r>
-        <w:t>4.2 H2: US Pre-DFAST vs DFAST-Era Regime Shift</w:t>
+        <w:t>4.2 Pre-DFAST vs DFAST-Era Regime Shift</w:t>
       </w:r>
     </w:p>
     <w:p>
@@ -581,7 +573,7 @@
         <w:pStyle w:val="Heading2"/>
       </w:pPr>
       <w:r>
-        <w:t>4.3 H3 + H5: Y-9C Cross-Sectional Validation (N=14)</w:t>
+        <w:t>4.3 Cross-Sectional Validation: CRE Exposure and Capital Building</w:t>
       </w:r>
     </w:p>
     <w:p>
@@ -594,7 +586,7 @@
         <w:pStyle w:val="Heading2"/>
       </w:pPr>
       <w:r>
-        <w:t>4.4 H7: FFIEC 031 Call Report Extension to N=20</w:t>
+        <w:t>4.4 Extension to N=20: FFIEC 031 Call Report</w:t>
       </w:r>
     </w:p>
     <w:p>
@@ -607,7 +599,7 @@
         <w:pStyle w:val="Heading2"/>
       </w:pPr>
       <w:r>
-        <w:t>4.5 Channel Decomposition: NIM, CRE, and HTM (H8–H9, NEW in v7.0)</w:t>
+        <w:t>4.5 Channel Decomposition: NIM, CRE, and HTM</w:t>
       </w:r>
     </w:p>
     <w:p>
@@ -620,12 +612,12 @@
         <w:pStyle w:val="Heading3"/>
       </w:pPr>
       <w:r>
-        <w:t>4.5.1 H8: NIM Compression Channel</w:t>
+        <w:t>4.5.1 NIM Compression Channel</w:t>
       </w:r>
     </w:p>
     <w:p>
       <w:r>
-        <w:t>H8 posits that during ZLB periods, high-NIM banks benefit more from dovish FOMC meetings. The mechanism is as follows: in normal times, dovish FOMC language signals lower future interest rates, which compresses net interest margins—bad for high-NIM banks. During ZLB periods, however, dovish language signals additional QE, which raises asset prices and generates trading income that compensates for NIM compression. The net effect during ZLB is therefore positive for high-NIM banks.</w:t>
+        <w:t>The NIM compression hypothesis posits that during ZLB periods, high-NIM banks benefit more from dovish FOMC meetings. The mechanism is as follows: in normal times, dovish FOMC language signals lower future interest rates, which compresses net interest margins—bad for high-NIM banks. During ZLB periods, however, dovish language signals additional QE, which raises asset prices and generates trading income that compensates for NIM compression. The net effect during ZLB is therefore positive for high-NIM banks.</w:t>
       </w:r>
     </w:p>
     <w:p>
@@ -637,7 +629,7 @@
           <w:i/>
           <w:sz w:val="20"/>
         </w:rPr>
-        <w:t>Figure 3. Channel Decomposition: NIM Compression and HTM Unrealized Loss.</w:t>
+        <w:t>Figure 3: Channel Decomposition — NIM Compression and HTM Unrealized Loss. This figure decomposes the cross-sectional transmission of FOMC language into two independent channels. Panel A shows the NIM compression channel: during ZLB periods, high-NIM banks benefit more from dovish FOMC (Dovish×ZLB×NIM = +0.68, p &lt; 0.001). Panel B shows the HTM unrealized loss channel: during rapid rate hikes, high-HTM banks suffer disproportionately (FastHike×HTM = −0.093, p &lt; 0.001).</w:t>
       </w:r>
     </w:p>
     <w:p>
@@ -754,12 +746,12 @@
         <w:pStyle w:val="Heading3"/>
       </w:pPr>
       <w:r>
-        <w:t>4.5.4 H9: HTM Unrealized Loss Channel</w:t>
+        <w:t>4.5.4 HTM Unrealized Loss Channel</w:t>
       </w:r>
     </w:p>
     <w:p>
       <w:r>
-        <w:t>H9 posits that during rapid rate hikes, high-HTM banks suffer significantly larger losses. The mechanism is as follows: during ZLB periods, banks accumulate large portfolios of held-to-maturity (HTM) securities to lock in low-yield income. When rates rise rapidly, these securities incur large unrealized losses that are NOT marked to market (unlike AFS securities). This creates information asymmetry: the market cannot observe the true extent of capital erosion, leading to uncertainty premiums and potential bank runs.</w:t>
+        <w:t>The HTM unrealized loss hypothesis posits that during rapid rate hikes, high-HTM banks suffer significantly larger losses. The mechanism is as follows: during ZLB periods, banks accumulate large portfolios of held-to-maturity (HTM) securities to lock in low-yield income. When rates rise rapidly, these securities incur large unrealized losses that are NOT marked to market (unlike AFS securities). This creates information asymmetry: the market cannot observe the true extent of capital erosion, leading to uncertainty premiums and potential bank runs.</w:t>
       </w:r>
     </w:p>
     <w:p>
@@ -4004,7 +3996,7 @@
           <w:i/>
           <w:sz w:val="20"/>
         </w:rPr>
-        <w:t>Figure 4. CRE Vulnerability Across Monetary Policy Regimes.</w:t>
+        <w:t>Figure 4: Commercial Real Estate Vulnerability Across Monetary Policy Regimes. This figure shows the differential impact of FOMC stance on high-CRE vs low-CRE banks across regimes. The CRE sensitivity channel operates primarily during ZLB periods (Dovish×ZLB×CRE = +0.25, p = 0.013).</w:t>
       </w:r>
     </w:p>
     <w:p>
@@ -5288,7 +5280,7 @@
           <w:i/>
           <w:sz w:val="20"/>
         </w:rPr>
-        <w:t>Figure 5. HTM vs AFS Securities Portfolio Composition Over Time.</w:t>
+        <w:t>Figure 5: HTM vs AFS Securities Portfolio Composition Over Time. This figure illustrates the divergence between held-to-maturity (HTM) and available-for-sale (AFS) securities during the 2022–2023 rapid rate hike period. HTM portfolios accumulate unrealized losses that are invisible under current accounting rules, while AFS losses are marked to market.</w:t>
       </w:r>
     </w:p>
     <w:p>
@@ -5407,7 +5399,7 @@
         <w:pStyle w:val="Heading1"/>
       </w:pPr>
       <w:r>
-        <w:t>5. Japan Results (H1, H2)</w:t>
+        <w:t>5. Japanese Bank Evidence</w:t>
       </w:r>
     </w:p>
     <w:p>
@@ -5434,7 +5426,7 @@
         <w:pStyle w:val="Heading1"/>
       </w:pPr>
       <w:r>
-        <w:t>6. H6: International Comparison (US vs Japan)</w:t>
+        <w:t>6. International Comparison: US vs Japan</w:t>
       </w:r>
     </w:p>
     <w:p>
@@ -5444,7 +5436,7 @@
           <w:i/>
           <w:sz w:val="20"/>
         </w:rPr>
-        <w:t>Figure 6. H6 International Comparison: Dovish-Hawkish Bank-Return Spread, US vs Japan. Notes: Pre-DFAST (1994–2008) vs DFAST-era (2008–2025). US N = 24 banks, Japan N = 11 banks. The pre-DFAST Japan effect (−1.40pp) is 57% larger than the US effect (−0.89pp).</w:t>
+        <w:t>Figure 6: International Comparison of Dovish-Hawkish Bank-Return Spread — US vs Japan. The pre-DFAST spread is −1.40pp for Japan vs −0.89pp for US, consistent with Japanese banks' greater dependence on international dollar funding (Rey, 2013). The DFAST-era collapse is observed in both countries. Notes: Pre-DFAST (1994–2008) vs DFAST-era (2008–2025). US N = 24 banks, Japan N = 11 banks. The pre-DFAST Japan effect (−1.40pp) is 57% larger than the US effect (−0.89pp).</w:t>
       </w:r>
     </w:p>
     <w:p>
@@ -5506,7 +5498,7 @@
           <w:i/>
           <w:sz w:val="20"/>
         </w:rPr>
-        <w:t>Figure 7. Reverse Stress Test Application. Panel A: Distribution of dovish-hawkish bank-return spreads by era, with CVaR(5%) markers. Panel B: Probability of loss under four monetary policy scenarios. ZLB1 Hawkish 7-year scenario: P(loss) = 88.5%, E[cum CAR] = −22.5%.</w:t>
+        <w:t>Figure 7: Reverse Stress Test Application. This figure applies the regime-conditional framework to reverse stress testing. Panel A shows the distribution of dovish-hawkish bank-return spreads by era, with conditional value-at-risk (CVaR) at the 5% level. Panel B displays the probability of portfolio loss exceeding regulatory thresholds under different FOMC stance-regime combinations. Panel A: Distribution of dovish-hawkish bank-return spreads by era, with CVaR(5%) markers. Panel B: Probability of loss under four monetary policy scenarios. ZLB1 Hawkish 7-year scenario: P(loss) = 88.5%, E[cum CAR] = −22.5%.</w:t>
       </w:r>
     </w:p>
     <w:p>
@@ -5558,7 +5550,7 @@
         <w:pStyle w:val="Heading1"/>
       </w:pPr>
       <w:r>
-        <w:t xml:space="preserve">8. Uncertainty Channel: When Signals Disagree (H10)</w:t>
+        <w:t>8. Uncertainty Channel: When Signals Disagree</w:t>
       </w:r>
     </w:p>
     <w:p>
@@ -5606,7 +5598,7 @@
         <w:rPr>
           <w:b/>
         </w:rPr>
-        <w:t>Table 8: FOMC Uncertainty Measurement Approaches Comparison</w:t>
+        <w:t>Table 8: Comparison of FOMC Uncertainty Measurement Approaches</w:t>
       </w:r>
     </w:p>
     <w:tbl>
@@ -6030,6 +6022,20 @@
         </w:tc>
       </w:tr>
     </w:tbl>
+    <w:p>
+      <w:pPr>
+        <w:jc w:val="center"/>
+      </w:pPr>
+      <w:r>
+        <w:rPr>
+          <w:i/>
+          <w:sz w:val="20"/>
+          <w:sz w:val="16"/>
+          <w:i/>
+        </w:rPr>
+        <w:t xml:space="preserve">Notes: Inner Confidence is measured from qwen-plus logprob entropy (Chen et al., 2025). Multi-model uses qwen-plus, qwen-turbo, and qwen-max. Temperature sampling uses qwen-plus at T=0.7 with 5 independent runs. Stance distance is |LM% stance − LLM stance| where Dovish = −1, Neutral = 0, Hawkish = +1. Composite index weights: LM-LLM disagreement (0.3), no rate change (0.25), LM distance from median (0.2), statement length (0.25).</w:t>
+      </w:r>
+    </w:p>
     <w:p>
       <w:pPr>
         <w:pStyle w:val="Heading2"/>
@@ -6094,7 +6100,7 @@
         <w:rPr>
           <w:b/>
         </w:rPr>
-        <w:t>Table 9: Stance Distance and Bank CAR — Regression Results</w:t>
+        <w:t>Table 9: Stance Distance and Bank Cumulative Abnormal Returns</w:t>
       </w:r>
     </w:p>
     <w:tbl>
@@ -6784,6 +6790,20 @@
         </w:tc>
       </w:tr>
     </w:tbl>
+    <w:p>
+      <w:pPr>
+        <w:jc w:val="center"/>
+      </w:pPr>
+      <w:r>
+        <w:rPr>
+          <w:i/>
+          <w:sz w:val="20"/>
+          <w:sz w:val="16"/>
+          <w:i/>
+        </w:rPr>
+        <w:t xml:space="preserve">Notes: The dependent variables are average CAR (pp) across 24 US DFAST banks and cross-sectional CAR variance (×10⁴). Stance Distance = |LM% stance − LLM stance| ∈ {0, 1, 2}. ZLB = 1 if the federal funds rate is at the zero lower bound. Dovish = 1 if LM% classifies the meeting as dovish. Heteroskedasticity-robust standard errors (HC1). *, **, *** denote significance at the 10%, 5%, and 1% levels, respectively. N = 146 FOMC meetings with available statement text.</w:t>
+      </w:r>
+    </w:p>
     <w:p>
       <w:pPr>
         <w:pStyle w:val="Heading2"/>
@@ -6831,7 +6851,7 @@
     </w:p>
     <w:p>
       <w:r>
-        <w:t>NEW in v7.0: The channel decomposition reveals four independent transmission mechanisms. The NIM compression channel (H8) and the CRE sensitivity channel operate during ZLB periods, while the HTM unrealized loss channel (H9) operates during rapid rate hikes. The asymmetry between HTM and AFS securities—HTM creates hidden capital erosion while AFS does not—has important policy implications. Current stress test scenarios (DFAST/CCAR) focus on credit risk and interest rate risk in the banking book, but do not explicitly model the information asymmetry created by HTM accounting. Our results suggest that stress tests should include a "ZLB-to-FastHike transition" scenario that specifically tests banks' resilience to HTM unrealized losses.</w:t>
+        <w:t>: The channel decomposition reveals four independent transmission mechanisms. The NIM compression channel (H8) and the CRE sensitivity channel operate during ZLB periods, while the HTM unrealized loss channel (H9) operates during rapid rate hikes. The asymmetry between HTM and AFS securities—HTM creates hidden capital erosion while AFS does not—has important policy implications. Current stress test scenarios (DFAST/CCAR) focus on credit risk and interest rate risk in the banking book, but do not explicitly model the information asymmetry created by HTM accounting. Our results suggest that stress tests should include a "ZLB-to-FastHike transition" scenario that specifically tests banks' resilience to HTM unrealized losses.</w:t>
       </w:r>
       <w:r>
         <w:rPr>
@@ -6848,7 +6868,7 @@
         <w:rPr>
           <w:sz w:val="22"/>
         </w:rPr>
-        <w:t xml:space="preserve"> The HTM vs AFS comparison in Table 6 constitutes a natural quasi-experiment analogous to the dual-class share design in Lu and Wu (2024): the same bank holds both HTM and AFS securities with identical underlying cash flows, differing only in accounting classification. The stark contrast—FastHike×HTM = −0.053 (t = −6.26) vs FastHike×AFS = +0.0003 (t = 2.87)—isolates the information asymmetry channel created by non-mark-to-market accounting, ruling out alternative explanations based on security-level fundamentals. NEW in v8.0: The uncertainty channel (H10) introduces a new dimension to stress testing: not just the magnitude of the shock, but the certainty with which it can be estimated. When LM% word-count sentiment and LLM semantic understanding disagree—what we term "stance distance"—the resulting uncertainty is itself a transmission channel. Stance distance significantly predicts worse bank returns (coef = −0.0091, p = 0.005) and higher cross-sectional dispersion (p = 0.058). The ZLB amplification effect (coef = +0.000332, p = 0.051) suggests that uncertainty is most dangerous when monetary policy is already constrained. The 2013 Taper Tantrum—where Bernanke's testimony created maximum confusion about the Fed's QE taper timeline—exhibits the highest stance distance in the ZLB subsample (z-score = 4.58), validating the measure's ability to capture real-world ambiguity.</w:t>
+        <w:t xml:space="preserve"> The HTM vs AFS comparison in Table 6 constitutes a natural quasi-experiment analogous to the dual-class share design in Lu and Wu (2024): the same bank holds both HTM and AFS securities with identical underlying cash flows, differing only in accounting classification. The stark contrast—FastHike×HTM = −0.053 (t = −6.26) vs FastHike×AFS = +0.0003 (t = 2.87)—isolates the information asymmetry channel created by non-mark-to-market accounting, ruling out alternative explanations based on security-level fundamentals. : The uncertainty channel (H10) introduces a new dimension to stress testing: not just the magnitude of the shock, but the certainty with which it can be estimated. When LM% word-count sentiment and LLM semantic understanding disagree—what we term "stance distance"—the resulting uncertainty is itself a transmission channel. Stance distance significantly predicts worse bank returns (coef = −0.0091, p = 0.005) and higher cross-sectional dispersion (p = 0.058). The ZLB amplification effect (coef = +0.000332, p = 0.051) suggests that uncertainty is most dangerous when monetary policy is already constrained. The 2013 Taper Tantrum—where Bernanke's testimony created maximum confusion about the Fed's QE taper timeline—exhibits the highest stance distance in the ZLB subsample (z-score = 4.58), validating the measure's ability to capture real-world ambiguity.</w:t>
       </w:r>
     </w:p>
     <w:p>
@@ -6866,7 +6886,7 @@
     </w:p>
     <w:p>
       <w:r>
-        <w:t>NEW in v7.0: We identify four independent channels through which FOMC language transmits to bank equity returns. During ZLB periods, the NIM compression channel (Dovish×ZLB×NIM = +0.68, p &lt; 0.001) and the CRE sensitivity channel (Dovish×ZLB×CRE = +0.25, p = 0.013) both make banks benefit from dovish FOMC. During rapid rate hikes, the HTM unrealized loss channel (FastHike×HTM = −0.09, p &lt; 0.001) makes high-HTM banks suffer disproportionately. The HTM channel dominates the CRE channel, providing a new interpretation of the 2023 SVB failure as an "HTM unrealized loss crisis" rather than a "CRE crisis."</w:t>
+        <w:t>: We identify four independent channels through which FOMC language transmits to bank equity returns. During ZLB periods, the NIM compression channel (Dovish×ZLB×NIM = +0.68, p &lt; 0.001) and the CRE sensitivity channel (Dovish×ZLB×CRE = +0.25, p = 0.013) both make banks benefit from dovish FOMC. During rapid rate hikes, the HTM unrealized loss channel (FastHike×HTM = −0.09, p &lt; 0.001) makes high-HTM banks suffer disproportionately. The HTM channel dominates the CRE channel, providing a new interpretation of the 2023 SVB failure as an "HTM unrealized loss crisis" rather than a "CRE crisis."</w:t>
       </w:r>
     </w:p>
     <w:p>

</xml_diff>